<commit_message>
chore: remove Calculate_Timer_Tick document and update STM32_Session_Instructor_Guide
- Deleted the Calculate_Timer_Tick.docx file as it is no longer needed.
- Added spacing for clarity in STM32_Session_Instructor_Guide.docx.
- Revised RTOS cautions section for better readability and emphasis on ISR safety.
</commit_message>
<xml_diff>
--- a/STM32/Latest-Session/STM32_Session_Instructor_Guide.docx
+++ b/STM32/Latest-Session/STM32_Session_Instructor_Guide.docx
@@ -4939,21 +4939,7 @@
         <w:rPr>
           <w:lang w:val="en-AE"/>
         </w:rPr>
-        <w:t xml:space="preserve"> (up to 36 MHz max for APB1, though the timer clock multiplier doubles it if the APB1 </w:t>
-      </w:r>
-      <w:proofErr w:type="spellStart"/>
-      <w:r>
-        <w:rPr>
-          <w:lang w:val="en-AE"/>
-        </w:rPr>
-        <w:t>prescaler</w:t>
-      </w:r>
-      <w:proofErr w:type="spellEnd"/>
-      <w:r>
-        <w:rPr>
-          <w:lang w:val="en-AE"/>
-        </w:rPr>
-        <w:t xml:space="preserve"> &gt; 1, resulting in 72 MHz).</w:t>
+        <w:t xml:space="preserve"> (up to 36 MHz max for APB1, though the timer clock multiplier doubles it if the APB1 prescaler &gt; 1, resulting in 72 MHz).</w:t>
       </w:r>
     </w:p>
     <w:p>
@@ -5721,50 +5707,22 @@
           <w:bCs/>
           <w:lang w:val="en-AE"/>
         </w:rPr>
-        <w:t xml:space="preserve">1 </w:t>
-      </w:r>
-      <w:proofErr w:type="spellStart"/>
+        <w:t>1 ms (0.001 s)</w:t>
+      </w:r>
+      <w:r>
+        <w:rPr>
+          <w:lang w:val="en-AE"/>
+        </w:rPr>
+        <w:t xml:space="preserve"> tick time and an interrupt or update every </w:t>
+      </w:r>
       <w:r>
         <w:rPr>
           <w:b/>
           <w:bCs/>
           <w:lang w:val="en-AE"/>
         </w:rPr>
-        <w:t>ms</w:t>
-      </w:r>
-      <w:proofErr w:type="spellEnd"/>
-      <w:r>
-        <w:rPr>
-          <w:b/>
-          <w:bCs/>
-          <w:lang w:val="en-AE"/>
-        </w:rPr>
-        <w:t xml:space="preserve"> (0.001 s)</w:t>
-      </w:r>
-      <w:r>
-        <w:rPr>
-          <w:lang w:val="en-AE"/>
-        </w:rPr>
-        <w:t xml:space="preserve"> tick time and an interrupt or update every </w:t>
-      </w:r>
-      <w:r>
-        <w:rPr>
-          <w:b/>
-          <w:bCs/>
-          <w:lang w:val="en-AE"/>
-        </w:rPr>
-        <w:t xml:space="preserve">10 </w:t>
-      </w:r>
-      <w:proofErr w:type="spellStart"/>
-      <w:r>
-        <w:rPr>
-          <w:b/>
-          <w:bCs/>
-          <w:lang w:val="en-AE"/>
-        </w:rPr>
-        <w:t>ms</w:t>
-      </w:r>
-      <w:proofErr w:type="spellEnd"/>
+        <w:t>10 ms</w:t>
+      </w:r>
       <w:r>
         <w:rPr>
           <w:lang w:val="en-AE"/>
@@ -5833,43 +5791,7 @@
           <w:bCs/>
           <w:lang w:val="en-AE"/>
         </w:rPr>
-        <w:t xml:space="preserve">Calculate </w:t>
-      </w:r>
-      <w:proofErr w:type="spellStart"/>
-      <w:r>
-        <w:rPr>
-          <w:b/>
-          <w:bCs/>
-          <w:lang w:val="en-AE"/>
-        </w:rPr>
-        <w:t>Prescaler</w:t>
-      </w:r>
-      <w:proofErr w:type="spellEnd"/>
-      <w:r>
-        <w:rPr>
-          <w:b/>
-          <w:bCs/>
-          <w:lang w:val="en-AE"/>
-        </w:rPr>
-        <w:t xml:space="preserve"> (PSC) for a 1 </w:t>
-      </w:r>
-      <w:proofErr w:type="spellStart"/>
-      <w:r>
-        <w:rPr>
-          <w:b/>
-          <w:bCs/>
-          <w:lang w:val="en-AE"/>
-        </w:rPr>
-        <w:t>ms</w:t>
-      </w:r>
-      <w:proofErr w:type="spellEnd"/>
-      <w:r>
-        <w:rPr>
-          <w:b/>
-          <w:bCs/>
-          <w:lang w:val="en-AE"/>
-        </w:rPr>
-        <w:t xml:space="preserve"> tick:</w:t>
+        <w:t>Calculate Prescaler (PSC) for a 1 ms tick:</w:t>
       </w:r>
     </w:p>
     <w:p>
@@ -6169,21 +6091,7 @@
         <w:rPr>
           <w:lang w:val="en-AE"/>
         </w:rPr>
-        <w:t xml:space="preserve">Target tick time = 1 </w:t>
-      </w:r>
-      <w:proofErr w:type="spellStart"/>
-      <w:r>
-        <w:rPr>
-          <w:lang w:val="en-AE"/>
-        </w:rPr>
-        <w:t>μs</w:t>
-      </w:r>
-      <w:proofErr w:type="spellEnd"/>
-      <w:r>
-        <w:rPr>
-          <w:lang w:val="en-AE"/>
-        </w:rPr>
-        <w:t xml:space="preserve"> = 0.000001 s</w:t>
+        <w:t>Target tick time = 1 μs = 0.000001 s</w:t>
       </w:r>
     </w:p>
     <w:p>
@@ -6313,21 +6221,7 @@
         <w:rPr>
           <w:lang w:val="en-AE"/>
         </w:rPr>
-        <w:t xml:space="preserve">(1 tick = 1 </w:t>
-      </w:r>
-      <w:proofErr w:type="spellStart"/>
-      <w:r>
-        <w:rPr>
-          <w:lang w:val="en-AE"/>
-        </w:rPr>
-        <w:t>μs</w:t>
-      </w:r>
-      <w:proofErr w:type="spellEnd"/>
-      <w:r>
-        <w:rPr>
-          <w:lang w:val="en-AE"/>
-        </w:rPr>
-        <w:t>).</w:t>
+        <w:t>(1 tick = 1 μs).</w:t>
       </w:r>
     </w:p>
     <w:p>
@@ -6355,25 +6249,7 @@
           <w:lang w:val="en-AE"/>
         </w:rPr>
         <w:lastRenderedPageBreak/>
-        <w:t xml:space="preserve">Calculate Auto-Reload Register (ARR) for a 1 </w:t>
-      </w:r>
-      <w:proofErr w:type="spellStart"/>
-      <w:r>
-        <w:rPr>
-          <w:b/>
-          <w:bCs/>
-          <w:lang w:val="en-AE"/>
-        </w:rPr>
-        <w:t>ms</w:t>
-      </w:r>
-      <w:proofErr w:type="spellEnd"/>
-      <w:r>
-        <w:rPr>
-          <w:b/>
-          <w:bCs/>
-          <w:lang w:val="en-AE"/>
-        </w:rPr>
-        <w:t xml:space="preserve"> (1000 µs) overflow:</w:t>
+        <w:t>Calculate Auto-Reload Register (ARR) for a 1 ms (1000 µs) overflow:</w:t>
       </w:r>
     </w:p>
     <w:p>
@@ -6582,7 +6458,6 @@
         <w:t xml:space="preserve"> or interactive calculators on </w:t>
       </w:r>
       <w:hyperlink r:id="rId10" w:tgtFrame="_blank" w:history="1">
-        <w:proofErr w:type="spellStart"/>
         <w:r>
           <w:rPr>
             <w:rStyle w:val="Hyperlink"/>
@@ -6590,7 +6465,6 @@
           </w:rPr>
           <w:t>DeepBlueMbedded</w:t>
         </w:r>
-        <w:proofErr w:type="spellEnd"/>
       </w:hyperlink>
       <w:r>
         <w:rPr>
@@ -9280,16 +9154,22 @@
     <w:p>
       <w:pPr>
         <w:pStyle w:val="CodeBlock"/>
+      </w:pPr>
+      <w:r>
+        <w:t>#endif</w:t>
+      </w:r>
+    </w:p>
+    <w:p>
+      <w:pPr>
+        <w:pStyle w:val="CodeBlock"/>
         <w:rPr>
           <w:rFonts w:hint="eastAsia"/>
         </w:rPr>
       </w:pPr>
-      <w:r>
-        <w:t>#endif</w:t>
-      </w:r>
-    </w:p>
-    <w:p>
-      <w:r>
+    </w:p>
+    <w:p>
+      <w:r>
+        <w:lastRenderedPageBreak/>
         <w:t>Explain the interface:</w:t>
       </w:r>
     </w:p>
@@ -9299,7 +9179,6 @@
         <w:spacing w:after="40"/>
       </w:pPr>
       <w:r>
-        <w:lastRenderedPageBreak/>
         <w:t>Include guards prevent duplicate header inclusion.</w:t>
       </w:r>
     </w:p>
@@ -10506,6 +10385,9 @@
           <w:p>
             <w:pPr>
               <w:spacing w:after="40"/>
+              <w:rPr>
+                <w:sz w:val="18"/>
+              </w:rPr>
             </w:pPr>
             <w:r>
               <w:rPr>
@@ -10527,7 +10409,18 @@
               <w:rPr>
                 <w:sz w:val="18"/>
               </w:rPr>
-              <w:t>More tasks do not automatically make a system more real-time. Analyze priorities, execution times, deadlines, queue capacity, stack sizes, interrupt priorities and shared resources. Never call RTOS APIs from an interrupt unless that API is explicitly ISR-safe and the interrupt priority is permitted.</w:t>
+              <w:t>More tasks do not automatically make a system more real-time. Analyze priorities, execution times, deadlines, queue capacity, stack sizes, interrupt priorities and shared resources.</w:t>
+            </w:r>
+          </w:p>
+          <w:p>
+            <w:pPr>
+              <w:spacing w:after="40"/>
+            </w:pPr>
+            <w:r>
+              <w:rPr>
+                <w:sz w:val="18"/>
+              </w:rPr>
+              <w:t>Never call RTOS APIs from an interrupt unless that API is explicitly ISR-safe and the interrupt priority is permitted.</w:t>
             </w:r>
           </w:p>
         </w:tc>
@@ -11483,8 +11376,26 @@
       <w:pPr>
         <w:pStyle w:val="Heading2"/>
       </w:pPr>
+    </w:p>
+    <w:p>
+      <w:pPr>
+        <w:pStyle w:val="Heading2"/>
+      </w:pPr>
       <w:r>
         <w:t>Quick knowledge check</w:t>
+      </w:r>
+    </w:p>
+    <w:p>
+      <w:pPr>
+        <w:pStyle w:val="ListNumber"/>
+        <w:numPr>
+          <w:ilvl w:val="0"/>
+          <w:numId w:val="13"/>
+        </w:numPr>
+        <w:spacing w:after="40"/>
+      </w:pPr>
+      <w:r>
+        <w:t>What does the .ioc file store, and what happens when code is regenerated?</w:t>
       </w:r>
     </w:p>
     <w:p>
@@ -11493,16 +11404,6 @@
         <w:spacing w:after="40"/>
       </w:pPr>
       <w:r>
-        <w:t>What does the .ioc file store, and what happens when code is regenerated?</w:t>
-      </w:r>
-    </w:p>
-    <w:p>
-      <w:pPr>
-        <w:pStyle w:val="ListNumber"/>
-        <w:spacing w:after="40"/>
-      </w:pPr>
-      <w:r>
-        <w:lastRenderedPageBreak/>
         <w:t>Why can a timer's input clock differ from the CPU clock?</w:t>
       </w:r>
     </w:p>
@@ -11666,17 +11567,8 @@
         <w:color w:val="52616B"/>
         <w:sz w:val="16"/>
       </w:rPr>
-      <w:t xml:space="preserve">STM32 • Configuration • Peripherals • Data Acquisition • Reusable Drivers • </w:t>
+      <w:t>STM32 • Configuration • Peripherals • Data Acquisition • Reusable Drivers • FreeRTOS</w:t>
     </w:r>
-    <w:proofErr w:type="spellStart"/>
-    <w:r>
-      <w:rPr>
-        <w:color w:val="52616B"/>
-        <w:sz w:val="16"/>
-      </w:rPr>
-      <w:t>FreeRTOS</w:t>
-    </w:r>
-    <w:proofErr w:type="spellEnd"/>
   </w:p>
 </w:ftr>
 </file>
@@ -12348,6 +12240,12 @@
   </w:num>
   <w:num w:numId="12" w16cid:durableId="1870677857">
     <w:abstractNumId w:val="11"/>
+  </w:num>
+  <w:num w:numId="13" w16cid:durableId="342972282">
+    <w:abstractNumId w:val="7"/>
+    <w:lvlOverride w:ilvl="0">
+      <w:startOverride w:val="1"/>
+    </w:lvlOverride>
   </w:num>
 </w:numbering>
 </file>

</xml_diff>